<commit_message>
Regenerate stale example outputs and add an MIT license
example_analysis.pptx/.docx/.md were committed before yesterday's bug
fixes (seasonal misclassification, faults-repaired wording, etc.), so
they no longer matched what the app currently produces against the
same input with no configuration changes, as the README claims.
Regenerated all three from the current code.

Also adds a LICENSE (MIT), which the repo was missing.

Co-Authored-By: Claude Sonnet 5 <noreply@anthropic.com>
</commit_message>
<xml_diff>
--- a/example_report.docx
+++ b/example_report.docx
@@ -16,7 +16,7 @@
           <w:color w:val="1E4D6B"/>
           <w:sz w:val="22"/>
         </w:rPr>
-        <w:t>Supermarket collection</w:t>
+        <w:t>supermarket_price_collection</w:t>
       </w:r>
     </w:p>
     <w:p>
@@ -25,7 +25,7 @@
           <w:color w:val="6B7C8C"/>
           <w:sz w:val="18"/>
         </w:rPr>
-        <w:t>6,600 observations · 87 items · 10 categories · Jan 2015 to Dec 2025 · 230 data faults repaired  ·  Produced 07 September 2026 by PriceLab.</w:t>
+        <w:t>6,600 observations · 87 items · 10 categories · Jan 2015 to Dec 2025 · 230 data faults repaired  ·  Produced 08 September 2026 by PriceLab.</w:t>
       </w:r>
     </w:p>
     <w:p>
@@ -792,7 +792,7 @@
     </w:p>
     <w:p>
       <w:r>
-        <w:t>117 values sit around one hundred times the level of their own item and 113 sit around one hundredth of it. The multipliers cluster tightly rather than forming a continuous tail, which is the signature of a unit of measurement fault rather than genuine price volatility. Because the mechanism is known, the true value can be restored by rescaling, so the observations were repaired rather than deleted. Deleting them would have broken the item continuity that a matched index depends on.</w:t>
+        <w:t>117 values sit around one hundred times the level of their own item and 113 sit around one hundredth of it. The multipliers cluster tightly rather than forming a continuous tail, which is the signature of a unit of measurement fault rather than genuine price volatility. Because the mechanism is known, the true value can be restored by rescaling. The observations were repaired rather than deleted. Deleting them would have broken the item continuity that a matched index depends on.</w:t>
       </w:r>
     </w:p>
     <w:p>
@@ -6397,7 +6397,7 @@
         <w:br/>
         <w:t xml:space="preserve">  },</w:t>
         <w:br/>
-        <w:t xml:space="preserve">  "label": "Supermarket collection"</w:t>
+        <w:t xml:space="preserve">  "label": "supermarket_price_collection"</w:t>
         <w:br/>
         <w:t>}</w:t>
       </w:r>

</xml_diff>